<commit_message>
Add CloudSim project, resume PDF download (replaces docx)
</commit_message>
<xml_diff>
--- a/Divij Jhunjhunwala.docx
+++ b/Divij Jhunjhunwala.docx
@@ -372,36 +372,7 @@
         </w:rPr>
       </w:pPr>
       <w:r>
-        <w:rPr>
-          <w:b/>
-          <w:bCs/>
-          <w:lang w:val="en-US"/>
-        </w:rPr>
-        <w:t>Dev Tools</w:t>
-      </w:r>
-      <w:r>
-        <w:rPr>
-          <w:lang w:val="en-US"/>
-        </w:rPr>
-        <w:t xml:space="preserve">: </w:t>
-      </w:r>
-      <w:r>
-        <w:rPr>
-          <w:lang w:val="en-US"/>
-        </w:rPr>
-        <w:t>Git, GitHub, VS Code, IntelliJ IDEA, Android Studio</w:t>
-      </w:r>
-      <w:r>
-        <w:rPr>
-          <w:lang w:val="en-US"/>
-        </w:rPr>
-        <w:t>, Flutter, npm, Figma, Canva</w:t>
-      </w:r>
-      <w:r>
-        <w:rPr>
-          <w:lang w:val="en-US"/>
-        </w:rPr>
-        <w:t>, NumPy</w:t>
+        <w:t>Dev Tools: Git, GitHub, VS Code, IntelliJ IDEA, Android Studio, Flutter, npm, Figma, Canva, NumPy, CloudSim</w:t>
       </w:r>
     </w:p>
     <w:p>
@@ -814,6 +785,33 @@
           <w:lang w:val="en-US"/>
         </w:rPr>
       </w:pPr>
+    </w:p>
+    <w:p>
+      <w:pPr/>
+    </w:p>
+    <w:p>
+      <w:pPr/>
+      <w:r>
+        <w:t>Energy-Aware VM Placement (CloudSim)</w:t>
+      </w:r>
+    </w:p>
+    <w:p>
+      <w:pPr/>
+      <w:r>
+        <w:t>Implemented PABFD and Round-Robin VM allocation policies in CloudSim 3.0.3 to reproduce Beloglazov et al. (2012)</w:t>
+      </w:r>
+    </w:p>
+    <w:p>
+      <w:pPr/>
+      <w:r>
+        <w:t>PABFD cut datacenter energy use by 48.6% with zero SLA violation; MBFD with migration cut 57.7% at ~3% SLA violation</w:t>
+      </w:r>
+    </w:p>
+    <w:p>
+      <w:pPr/>
+      <w:r>
+        <w:t>Code: github.com/DJJW26/CloudSim</w:t>
+      </w:r>
     </w:p>
     <w:sectPr>
       <w:pgSz w:w="11906" w:h="16838"/>

</xml_diff>

<commit_message>
Use Divij's own resume PDF as download; docx formatting updates
</commit_message>
<xml_diff>
--- a/Divij Jhunjhunwala.docx
+++ b/Divij Jhunjhunwala.docx
@@ -72,6 +72,7 @@
         <w:t xml:space="preserve"> | </w:t>
       </w:r>
       <w:hyperlink r:id="rId7" w:history="1">
+        <w:proofErr w:type="spellStart"/>
         <w:r>
           <w:rPr>
             <w:rStyle w:val="Hyperlink"/>
@@ -79,6 +80,7 @@
           </w:rPr>
           <w:t>Github</w:t>
         </w:r>
+        <w:proofErr w:type="spellEnd"/>
       </w:hyperlink>
     </w:p>
     <w:p>
@@ -323,7 +325,14 @@
         <w:rPr>
           <w:lang w:val="en-US"/>
         </w:rPr>
-        <w:t>: HTML, CSS, Svelte</w:t>
+        <w:t xml:space="preserve">: HTML, CSS, </w:t>
+      </w:r>
+      <w:proofErr w:type="spellStart"/>
+      <w:r>
+        <w:rPr>
+          <w:lang w:val="en-US"/>
+        </w:rPr>
+        <w:t>Svelte</w:t>
       </w:r>
       <w:r>
         <w:rPr>
@@ -331,6 +340,7 @@
         </w:rPr>
         <w:t>Kit</w:t>
       </w:r>
+      <w:proofErr w:type="spellEnd"/>
       <w:r>
         <w:rPr>
           <w:lang w:val="en-US"/>
@@ -362,18 +372,39 @@
         <w:rPr>
           <w:lang w:val="en-US"/>
         </w:rPr>
-        <w:t>, Supabase</w:t>
-      </w:r>
-    </w:p>
-    <w:p>
-      <w:pPr>
-        <w:rPr>
-          <w:lang w:val="en-US"/>
-        </w:rPr>
-      </w:pPr>
-      <w:r>
-        <w:t>Dev Tools: Git, GitHub, VS Code, IntelliJ IDEA, Android Studio, Flutter, npm, Figma, Canva, NumPy, CloudSim</w:t>
-      </w:r>
+        <w:t xml:space="preserve">, </w:t>
+      </w:r>
+      <w:proofErr w:type="spellStart"/>
+      <w:r>
+        <w:rPr>
+          <w:lang w:val="en-US"/>
+        </w:rPr>
+        <w:t>Supabase</w:t>
+      </w:r>
+      <w:proofErr w:type="spellEnd"/>
+    </w:p>
+    <w:p>
+      <w:pPr>
+        <w:rPr>
+          <w:lang w:val="en-US"/>
+        </w:rPr>
+      </w:pPr>
+      <w:r>
+        <w:t xml:space="preserve">Dev Tools: Git, GitHub, VS Code, IntelliJ IDEA, Android Studio, Flutter, </w:t>
+      </w:r>
+      <w:proofErr w:type="spellStart"/>
+      <w:r>
+        <w:t>npm</w:t>
+      </w:r>
+      <w:proofErr w:type="spellEnd"/>
+      <w:r>
+        <w:t xml:space="preserve">, Figma, Canva, NumPy, </w:t>
+      </w:r>
+      <w:proofErr w:type="spellStart"/>
+      <w:r>
+        <w:t>CloudSim</w:t>
+      </w:r>
+      <w:proofErr w:type="spellEnd"/>
     </w:p>
     <w:p>
       <w:pPr>
@@ -738,7 +769,21 @@
         <w:rPr>
           <w:lang w:val="en-US"/>
         </w:rPr>
-        <w:t>Built backend services using Python and Flask with HuggingFace models</w:t>
+        <w:t xml:space="preserve">Built backend services using Python and Flask with </w:t>
+      </w:r>
+      <w:proofErr w:type="spellStart"/>
+      <w:r>
+        <w:rPr>
+          <w:lang w:val="en-US"/>
+        </w:rPr>
+        <w:t>HuggingFace</w:t>
+      </w:r>
+      <w:proofErr w:type="spellEnd"/>
+      <w:r>
+        <w:rPr>
+          <w:lang w:val="en-US"/>
+        </w:rPr>
+        <w:t xml:space="preserve"> models</w:t>
       </w:r>
     </w:p>
     <w:p>
@@ -779,38 +824,58 @@
         <w:t>Used Flutter and Dart to develop a Parking Lot interface to handle logistics</w:t>
       </w:r>
     </w:p>
-    <w:p>
-      <w:pPr>
-        <w:rPr>
-          <w:lang w:val="en-US"/>
-        </w:rPr>
-      </w:pPr>
-    </w:p>
-    <w:p>
-      <w:pPr/>
-    </w:p>
-    <w:p>
-      <w:pPr/>
-      <w:r>
-        <w:t>Energy-Aware VM Placement (CloudSim)</w:t>
-      </w:r>
-    </w:p>
-    <w:p>
-      <w:pPr/>
-      <w:r>
-        <w:t>Implemented PABFD and Round-Robin VM allocation policies in CloudSim 3.0.3 to reproduce Beloglazov et al. (2012)</w:t>
-      </w:r>
-    </w:p>
-    <w:p>
-      <w:pPr/>
-      <w:r>
-        <w:t>PABFD cut datacenter energy use by 48.6% with zero SLA violation; MBFD with migration cut 57.7% at ~3% SLA violation</w:t>
-      </w:r>
-    </w:p>
-    <w:p>
-      <w:pPr/>
-      <w:r>
-        <w:t>Code: github.com/DJJW26/CloudSim</w:t>
+    <w:p/>
+    <w:p>
+      <w:r>
+        <w:t>Energy-Aware VM Placement (</w:t>
+      </w:r>
+      <w:proofErr w:type="spellStart"/>
+      <w:r>
+        <w:t>CloudSim</w:t>
+      </w:r>
+      <w:proofErr w:type="spellEnd"/>
+      <w:r>
+        <w:t>)</w:t>
+      </w:r>
+    </w:p>
+    <w:p>
+      <w:pPr>
+        <w:pStyle w:val="ListParagraph"/>
+        <w:numPr>
+          <w:ilvl w:val="0"/>
+          <w:numId w:val="3"/>
+        </w:numPr>
+      </w:pPr>
+      <w:r>
+        <w:t xml:space="preserve">Implemented PABFD and Round-Robin VM allocation policies in </w:t>
+      </w:r>
+      <w:proofErr w:type="spellStart"/>
+      <w:r>
+        <w:t>CloudSim</w:t>
+      </w:r>
+      <w:proofErr w:type="spellEnd"/>
+      <w:r>
+        <w:t xml:space="preserve"> 3.0.3 to reproduce Beloglazov et al. (2012)</w:t>
+      </w:r>
+    </w:p>
+    <w:p>
+      <w:pPr>
+        <w:pStyle w:val="ListParagraph"/>
+        <w:numPr>
+          <w:ilvl w:val="0"/>
+          <w:numId w:val="3"/>
+        </w:numPr>
+      </w:pPr>
+      <w:r>
+        <w:t xml:space="preserve">PABFD cut </w:t>
+      </w:r>
+      <w:proofErr w:type="spellStart"/>
+      <w:r>
+        <w:t>datacenter</w:t>
+      </w:r>
+      <w:proofErr w:type="spellEnd"/>
+      <w:r>
+        <w:t xml:space="preserve"> energy use by 48.6% with zero SLA violation; MBFD with migration cut 57.7% at ~3% SLA violation</w:t>
       </w:r>
     </w:p>
     <w:sectPr>
@@ -1054,7 +1119,7 @@
   <w:abstractNum w:abstractNumId="2" w15:restartNumberingAfterBreak="0">
     <w:nsid w:val="603E78ED"/>
     <w:multiLevelType w:val="hybridMultilevel"/>
-    <w:tmpl w:val="E3CA7B72"/>
+    <w:tmpl w:val="70085A1E"/>
     <w:lvl w:ilvl="0" w:tplc="40090001">
       <w:start w:val="1"/>
       <w:numFmt w:val="bullet"/>

</xml_diff>